<commit_message>
dashboard insights: symptom cards, trend charts, protocol markers, experiment assessment data
</commit_message>
<xml_diff>
--- a/Baseline Files/baseline-technical-readme.docx
+++ b/Baseline Files/baseline-technical-readme.docx
@@ -924,6 +924,22 @@
       </w:pPr>
       <w:r>
         <w:t xml:space="preserve">Log today — POST /protocols/&lt;id&gt;/log upserts a ProtocolCompliance record for today (took bool + optional notes). If a record already exists for today it is updated in place rather than creating a duplicate.</w:t>
+      </w:r>
+    </w:p>
+    <w:p>
+      <w:pPr>
+        <w:spacing w:after="120"/>
+      </w:pPr>
+      <w:r>
+        <w:t xml:space="preserve">Dashboard — GET / (index route) computes all chart data server-side and passes it to index.html as JSON-serialisable context. Computed values: per-symptom cards with current month average score and percentage change from user’s baseline_score; 12-week episode counts bucketed into weekly bins; per-symptom weekly average score datasets for the line chart; protocol start date positions for vertical annotation lines; rescue stats (times used, avg effectiveness, avg time to relief); and a has_chart_data flag (true when episodes span at least 14 days). Chart.js is loaded on demand via the {% block head_extra %} extension point added to base.html.</w:t>
+      </w:r>
+    </w:p>
+    <w:p>
+      <w:pPr>
+        <w:spacing w:after="120"/>
+      </w:pPr>
+      <w:r>
+        <w:t xml:space="preserve">Experiment assessment — GET/POST /experiments/&lt;id&gt;/assess renders assess_experiment.html with a two-column layout: a sticky data panel on the left showing before/during episode frequency (episodes per week), per-symptom average score before vs during the experiment, and a mini Chart.js trend chart with a vertical “Start” annotation line; the assessment form on the right. Gracefully handles the case where no pre-experiment episode data exists.</w:t>
       </w:r>
     </w:p>
     <w:p>

</xml_diff>

<commit_message>
update docs, ignore pycache
</commit_message>
<xml_diff>
--- a/Baseline Files/baseline-technical-readme.docx
+++ b/Baseline Files/baseline-technical-readme.docx
@@ -445,7 +445,8 @@
           <w:sz w:val="20"/>
           <w:szCs w:val="20"/>
         </w:rPr>
-        <w:t xml:space="preserve">    ANTHROPIC_API_KEY=sk-ant-your-key-here</w:t>
+        <w:t xml:space="preserve">    ANTHROPIC_API_KEY=sk-ant-your-key-here
+    SECRET_KEY=your-long-random-secret-key</w:t>
       </w:r>
     </w:p>
     <w:p>
@@ -674,7 +675,7 @@
           <w:b w:val="false"/>
           <w:bCs w:val="false"/>
         </w:rPr>
-        <w:t xml:space="preserve">User — single user with onboarding state and baseline data</w:t>
+        <w:t xml:space="preserve">User — email, password_hash (bcrypt), invite_code_used, is_active, onboarding state, baseline data, and AI logging flag</w:t>
       </w:r>
     </w:p>
     <w:p>
@@ -832,6 +833,23 @@
     </w:p>
     <w:p>
       <w:pPr>
+        <w:pStyle w:val="ListParagraph"/>
+        <w:numPr>
+          <w:ilvl w:val="0"/>
+          <w:numId w:val="2"/>
+        </w:numPr>
+        <w:spacing w:after="100"/>
+      </w:pPr>
+      <w:r>
+        <w:rPr>
+          <w:b w:val="false"/>
+          <w:bCs w:val="false"/>
+        </w:rPr>
+        <w:t xml:space="preserve">InviteCode — invite codes for registration gating (code string, used bool, used_by_user_id FK)</w:t>
+      </w:r>
+    </w:p>
+    <w:p>
+      <w:pPr>
         <w:spacing w:after="120"/>
       </w:pPr>
       <w:r>
@@ -931,6 +949,30 @@
         <w:spacing w:after="120"/>
       </w:pPr>
       <w:r>
+        <w:t xml:space="preserve">Authentication — /login (GET/POST), /register (GET/POST), /logout (GET). get_user() reads session[‘user_id’] to identify the current user. A before_request hook enforces the auth gate (redirects unauthenticated requests to /login) and the onboarding gate. Session lifetime is 30 days when “remember me” is checked. Passwords hashed with flask-bcrypt. Registration requires a valid unused invite code, unique email, 8+ character password, and matching confirmation. Login shows a generic “Invalid email or password” message on failure to avoid leaking account existence. Logout clears the session. Existing users without credentials are auto-migrated at startup via migrate_existing_user() (admin@baseline.app / Baseline2026!).</w:t>
+      </w:r>
+    </w:p>
+    <w:p>
+      <w:pPr>
+        <w:spacing w:after="120"/>
+      </w:pPr>
+      <w:r>
+        <w:t xml:space="preserve">Dev invite — GET /dev/create-invite generates an invite code (debug mode only, requires auth).</w:t>
+      </w:r>
+    </w:p>
+    <w:p>
+      <w:pPr>
+        <w:spacing w:after="120"/>
+      </w:pPr>
+      <w:r>
+        <w:t xml:space="preserve">Account settings — POST /settings/email validates current password, checks email format and uniqueness, then updates user.email. POST /settings/password validates current password, enforces 8-character minimum, confirms match, then updates user.password_hash. Session is preserved after a password change so the user stays logged in. Errors and success messages surface via flash toasts. Both forms live in the Account section of settings.html, below the email/logout display, each submitting to its own route.</w:t>
+      </w:r>
+    </w:p>
+    <w:p>
+      <w:pPr>
+        <w:spacing w:after="120"/>
+      </w:pPr>
+      <w:r>
         <w:t xml:space="preserve">Dashboard — GET / (index route) computes all chart data server-side and passes it to index.html as JSON-serialisable context. Computed values: per-symptom cards with current month average score and percentage change from user’s baseline_score; 12-week episode counts bucketed into weekly bins; per-symptom weekly average score datasets for the line chart; protocol start date positions for vertical annotation lines; rescue stats (times used, avg effectiveness, avg time to relief); and a has_chart_data flag (true when episodes span at least 14 days). Chart.js is loaded on demand via the {% block head_extra %} extension point added to base.html.</w:t>
       </w:r>
     </w:p>
@@ -1063,6 +1105,23 @@
           <w:bCs w:val="false"/>
         </w:rPr>
         <w:t xml:space="preserve">ANTHROPIC_API_KEY — required for AI check-in feature. Get from console.anthropic.com</w:t>
+      </w:r>
+    </w:p>
+    <w:p>
+      <w:pPr>
+        <w:pStyle w:val="ListParagraph"/>
+        <w:numPr>
+          <w:ilvl w:val="0"/>
+          <w:numId w:val="2"/>
+        </w:numPr>
+        <w:spacing w:after="100"/>
+      </w:pPr>
+      <w:r>
+        <w:rPr>
+          <w:b w:val="false"/>
+          <w:bCs w:val="false"/>
+        </w:rPr>
+        <w:t xml:space="preserve">SECRET_KEY — required for session signing. Set a long random string in .env. Falls back to a dev-only hardcoded value if not set (never use the fallback in production).</w:t>
       </w:r>
     </w:p>
     <w:p>
@@ -1280,24 +1339,24 @@
           <w:b w:val="false"/>
           <w:bCs w:val="false"/>
         </w:rPr>
-        <w:t xml:space="preserve">Complete insights/charts feature</w:t>
-      </w:r>
-    </w:p>
-    <w:p>
-      <w:pPr>
-        <w:pStyle w:val="ListParagraph"/>
-        <w:numPr>
-          <w:ilvl w:val="0"/>
-          <w:numId w:val="2"/>
-        </w:numPr>
-        <w:spacing w:after="100"/>
-      </w:pPr>
-      <w:r>
-        <w:rPr>
-          <w:b w:val="false"/>
-          <w:bCs w:val="false"/>
-        </w:rPr>
-        <w:t xml:space="preserve">Add user authentication</w:t>
+        <w:t xml:space="preserve">Complete insights/charts feature — shipped</w:t>
+      </w:r>
+    </w:p>
+    <w:p>
+      <w:pPr>
+        <w:pStyle w:val="ListParagraph"/>
+        <w:numPr>
+          <w:ilvl w:val="0"/>
+          <w:numId w:val="2"/>
+        </w:numPr>
+        <w:spacing w:after="100"/>
+      </w:pPr>
+      <w:r>
+        <w:rPr>
+          <w:b w:val="false"/>
+          <w:bCs w:val="false"/>
+        </w:rPr>
+        <w:t xml:space="preserve">Add user authentication — shipped</w:t>
       </w:r>
     </w:p>
     <w:p>

</xml_diff>

<commit_message>
PWA: manifest, service worker, icons, offline page, install prompt
</commit_message>
<xml_diff>
--- a/Baseline Files/baseline-technical-readme.docx
+++ b/Baseline Files/baseline-technical-readme.docx
@@ -106,7 +106,7 @@
           <w:b w:val="false"/>
           <w:bCs w:val="false"/>
         </w:rPr>
-        <w:t xml:space="preserve">Database: SQLite via SQLAlchemy ORM</w:t>
+        <w:t xml:space="preserve">Database: PostgreSQL in production (Railway), SQLite for local development — both via SQLAlchemy ORM</w:t>
       </w:r>
     </w:p>
     <w:p>
@@ -877,7 +877,7 @@
         <w:spacing w:after="120"/>
       </w:pPr>
       <w:r>
-        <w:t xml:space="preserve">Onset null-safety — the system prompt explicitly instructs Claude: “Never return null for onset when had_episode is true.” If onset is still null or unparseable on arrival, the server falls back to datetime.utcnow() as a safety net.</w:t>
+        <w:t xml:space="preserve">Onset fallback chain — episode onset resolves through three independent try/except blocks in order: (1) parse the AI-returned onset string; (2) if that fails, parse client_time from the hidden field (correct local timestamp); (3) if that also fails, fall back to datetime.utcnow() as last resort. Each source has its own block so a malformed AI onset (e.g. “March 1 afternoon” instead of “2026-03-01T14:30”) no longer skips the client_time fallback. The system prompt also instructs Claude: “Never return null for onset when had_episode is true.” A hidden client_tz field additionally sends the browser’s IANA timezone name (e.g. America/New_York) for future use.</w:t>
       </w:r>
     </w:p>
     <w:p>
@@ -949,7 +949,7 @@
         <w:spacing w:after="120"/>
       </w:pPr>
       <w:r>
-        <w:t xml:space="preserve">Authentication — /login (GET/POST), /register (GET/POST), /logout (GET). get_user() reads session[‘user_id’] to identify the current user. A before_request hook enforces the auth gate (redirects unauthenticated requests to /login) and the onboarding gate. Session lifetime is 30 days when “remember me” is checked. Passwords hashed with flask-bcrypt. Registration requires a valid unused invite code, unique email, 8+ character password, and matching confirmation. Login shows a generic “Invalid email or password” message on failure to avoid leaking account existence. Logout clears the session. Existing users without credentials are auto-migrated at startup via migrate_existing_user() (admin@baseline.app / Baseline2026!).</w:t>
+        <w:t xml:space="preserve">Authentication — /login (GET/POST), /register (GET/POST), /logout (GET). get_user() reads session[‘user_id’] to identify the current user. A before_request hook enforces the auth gate (redirects unauthenticated requests to /login) and the onboarding gate. Session lifetime is 30 days when “remember me” is checked. Passwords hashed with flask-bcrypt. Registration requires a valid unused invite code, unique email, password meeting strength requirements (8+ characters, one uppercase, one number), and matching confirmation. Real-time strength meter (Weak/Fair/Strong) and inline match validation on register.html and the change password form in settings.html; submit button disabled until all requirements are met. Backend enforces the same rules as a second check. Login shows a generic “Invalid email or password” message on failure. Logout clears the session. Existing users auto-migrated at startup via migrate_existing_user().</w:t>
       </w:r>
     </w:p>
     <w:p>
@@ -973,15 +973,23 @@
         <w:spacing w:after="120"/>
       </w:pPr>
       <w:r>
-        <w:t xml:space="preserve">Dashboard — GET / (index route) computes all chart data server-side and passes it to index.html as JSON-serialisable context. Computed values: per-symptom cards with current month average score and percentage change from user’s baseline_score; 12-week episode counts bucketed into weekly bins; per-symptom weekly average score datasets for the line chart; protocol start date positions for vertical annotation lines; rescue stats (times used, avg effectiveness, avg time to relief); and a has_chart_data flag (true when episodes span at least 14 days). Chart.js is loaded on demand via the {% block head_extra %} extension point added to base.html.</w:t>
-      </w:r>
-    </w:p>
-    <w:p>
-      <w:pPr>
-        <w:spacing w:after="120"/>
-      </w:pPr>
-      <w:r>
-        <w:t xml:space="preserve">Experiment assessment — GET/POST /experiments/&lt;id&gt;/assess renders assess_experiment.html with a two-column layout: a sticky data panel on the left showing before/during episode frequency (episodes per week), per-symptom average score before vs during the experiment, and a mini Chart.js trend chart with a vertical “Start” annotation line; the assessment form on the right. Gracefully handles the case where no pre-experiment episode data exists.</w:t>
+        <w:t xml:space="preserve">Help page — GET /help renders help.html. Eight sections mirroring the user guide, with a pill-style clickable table of contents at the top and anchor IDs on each section for direct linking. Covers: getting started, dashboard (symptom cards, episode frequency chart, symptom trends, protocol impact markers, rescue effectiveness table, chart appearance threshold), daily check-in, logging episodes, protocols, experiments, symptoms, and a closing section with contact email. Links throughout to relevant app pages. Sidebar entry positioned between Settings and Log out. Styled with dark-theme CSS: muted body text, purple accent bullets and links, max-width 680px, responsive TOC.</w:t>
+      </w:r>
+    </w:p>
+    <w:p>
+      <w:pPr>
+        <w:spacing w:after="120"/>
+      </w:pPr>
+      <w:r>
+        <w:t xml:space="preserve">Dashboard — GET / (index route) computes all chart data server-side and passes it to index.html as JSON-serialisable context. Computed values: per-symptom cards with current month average score and percentage change from user’s baseline_score; 12 weeks + current partial week bucketed into weekly bins; per-symptom weekly average score datasets for the line chart; protocol start date positions for vertical annotation lines; rescue stats (times used, avg effectiveness, avg time to relief); and a has_chart_data flag (true when episodes span at least 14 days). Current partial week is labeled with a * suffix (e.g. “Mar 3 *”) and a footnote reads “* Current week (in progress)”. Section subtitle reads “Last 12 weeks + current week”. Chart.js is loaded on demand via the {% block head_extra %} extension point added to base.html.</w:t>
+      </w:r>
+    </w:p>
+    <w:p>
+      <w:pPr>
+        <w:spacing w:after="120"/>
+      </w:pPr>
+      <w:r>
+        <w:t xml:space="preserve">Experiment assessment — GET/POST /experiments/&lt;id&gt;/assess renders assess_experiment.html with a two-column layout: a sticky data panel on the left showing before/during episode frequency (episodes per week), per-symptom average score before vs during the experiment, and a mini Chart.js trend chart with a vertical “Start” annotation line; the assessment form on the right. Gracefully handles the case where no pre-experiment episode data exists. Default stabilization period is 3 weeks (changed from 8) across the model, routes, form defaults, and JS fallbacks.</w:t>
       </w:r>
     </w:p>
     <w:p>
@@ -997,6 +1005,54 @@
         <w:pStyle w:val="Heading2"/>
       </w:pPr>
       <w:r>
+        <w:t xml:space="preserve">Form Validation</w:t>
+      </w:r>
+    </w:p>
+    <w:p>
+      <w:pPr>
+        <w:spacing w:after="120"/>
+      </w:pPr>
+      <w:r>
+        <w:t xml:space="preserve">Character limits — name fields on symptom, protocol, rescue option, and experiment forms are capped at 200 characters. Notes, description, and hypothesis fields are capped at 500 characters. Implemented via a data-charlimit attribute (not maxlength) so users can see how far over the limit they are. A live counter (e.g. “142/200”) appears on every limited field; counter turns red and an inline error message appears when over limit. Submit button disables when any field exceeds its limit and re-enables when corrected. Backend validates all limits as a second check, returning flash error messages. Counter and submit-guard logic is shared via base.html. Symptom name column in the database widened from varchar(100) to varchar(200) with a migration for PostgreSQL.</w:t>
+      </w:r>
+    </w:p>
+    <w:p>
+      <w:pPr>
+        <w:spacing w:after="120"/>
+      </w:pPr>
+      <w:r>
+        <w:t xml:space="preserve">Duplicate symptom prevention — case-insensitive duplicate check on symptom name per user in both new and edit routes. Flash error: “A symptom named ‘X’ already exists.”</w:t>
+      </w:r>
+    </w:p>
+    <w:p>
+      <w:pPr>
+        <w:spacing w:after="120"/>
+      </w:pPr>
+      <w:r>
+        <w:t xml:space="preserve">Future episode date prevention — onset datetime input has its max attribute set dynamically via JS to the current local time, preventing selection of future dates. Backend rejects future onset values with a flash error.</w:t>
+      </w:r>
+    </w:p>
+    <w:p>
+      <w:pPr>
+        <w:spacing w:after="120"/>
+      </w:pPr>
+      <w:r>
+        <w:t xml:space="preserve">Onboarding nav lock — a context processor injects an onboarding_in_progress flag. During onboarding, sidebar nav links are greyed out (30% opacity, cursor: not-allowed) with a tooltip: “Complete setup to access this section.” Logout link remains active.</w:t>
+      </w:r>
+    </w:p>
+    <w:p>
+      <w:pPr>
+        <w:spacing w:after="120"/>
+      </w:pPr>
+      <w:r>
+        <w:t xml:space="preserve"/>
+      </w:r>
+    </w:p>
+    <w:p>
+      <w:pPr>
+        <w:pStyle w:val="Heading2"/>
+      </w:pPr>
+      <w:r>
         <w:t xml:space="preserve">Bug Fixes</w:t>
       </w:r>
     </w:p>
@@ -1029,6 +1085,30 @@
         <w:spacing w:after="120"/>
       </w:pPr>
       <w:r>
+        <w:t xml:space="preserve">load_dotenv override — load_dotenv() defaults to override=False, meaning any env var already set in the shell (even to a stale or empty value) silently wins over .env. Changed to load_dotenv(override=True) so .env always takes precedence. Root cause of ANTHROPIC_API_KEY being ignored when the key existed in the shell environment.</w:t>
+      </w:r>
+    </w:p>
+    <w:p>
+      <w:pPr>
+        <w:spacing w:after="120"/>
+      </w:pPr>
+      <w:r>
+        <w:t xml:space="preserve">Unhandled AuthenticationError on check-in — a bad or missing API key caused parse_checkin to crash with an unhandled exception. Now catches anthropic.AuthenticationError and returns a clear error message to the user instead of a 500.</w:t>
+      </w:r>
+    </w:p>
+    <w:p>
+      <w:pPr>
+        <w:spacing w:after="120"/>
+      </w:pPr>
+      <w:r>
+        <w:t xml:space="preserve">Onset fallback skipping client_time — a single try/except block wrapped all three onset sources. When the AI returned an unparseable onset string, the exception handler jumped directly to datetime.utcnow(), skipping the client_time fallback that already held the correct local timestamp. Fixed by splitting into three independent try/except blocks (AI onset → client_time → UTC) so each source gets its own chance before the next is tried.</w:t>
+      </w:r>
+    </w:p>
+    <w:p>
+      <w:pPr>
+        <w:spacing w:after="120"/>
+      </w:pPr>
+      <w:r>
         <w:t xml:space="preserve"/>
       </w:r>
     </w:p>
@@ -1054,7 +1134,7 @@
           <w:b w:val="false"/>
           <w:bCs w:val="false"/>
         </w:rPr>
-        <w:t xml:space="preserve">SQLite is single-file and not suited for multi-user concurrent access at scale — migrate to PostgreSQL before production launch</w:t>
+        <w:t xml:space="preserve">SQLite is used for local development only. Production runs PostgreSQL via Railway. The DATABASE_URL env var switches the connection; see Environment Variables.</w:t>
       </w:r>
     </w:p>
     <w:p>
@@ -1122,6 +1202,23 @@
           <w:bCs w:val="false"/>
         </w:rPr>
         <w:t xml:space="preserve">SECRET_KEY — required for session signing. Set a long random string in .env. Falls back to a dev-only hardcoded value if not set (never use the fallback in production).</w:t>
+      </w:r>
+    </w:p>
+    <w:p>
+      <w:pPr>
+        <w:pStyle w:val="ListParagraph"/>
+        <w:numPr>
+          <w:ilvl w:val="0"/>
+          <w:numId w:val="2"/>
+        </w:numPr>
+        <w:spacing w:after="100"/>
+      </w:pPr>
+      <w:r>
+        <w:rPr>
+          <w:b w:val="false"/>
+          <w:bCs w:val="false"/>
+        </w:rPr>
+        <w:t xml:space="preserve">DATABASE_URL — optional. When set (Railway provides this automatically), the app uses it as the SQLAlchemy URI instead of SQLite. Railway connection strings start with postgres:// — the app rewrites this to postgresql:// automatically since SQLAlchemy requires the latter. When absent, falls back to the local SQLite file.</w:t>
       </w:r>
     </w:p>
     <w:p>
@@ -1322,6 +1419,46 @@
         <w:pStyle w:val="Heading1"/>
       </w:pPr>
       <w:r>
+        <w:t xml:space="preserve">Deployment</w:t>
+      </w:r>
+    </w:p>
+    <w:p>
+      <w:pPr>
+        <w:spacing w:after="120"/>
+      </w:pPr>
+      <w:r>
+        <w:t xml:space="preserve">Platform: Railway. Deployed via GitHub — pushes to main trigger an automatic redeploy. Railway uses nixpacks to auto-detect the Python/Flask app; no Procfile is required.</w:t>
+      </w:r>
+    </w:p>
+    <w:p>
+      <w:pPr>
+        <w:spacing w:after="120"/>
+      </w:pPr>
+      <w:r>
+        <w:t xml:space="preserve">Database: Railway provisions a PostgreSQL instance and injects DATABASE_URL automatically. The app rewrites postgres:// to postgresql:// at startup and calls db.create_all() and run_migrations() at import time, so the schema is always current on first boot and after deploys.</w:t>
+      </w:r>
+    </w:p>
+    <w:p>
+      <w:pPr>
+        <w:spacing w:after="120"/>
+      </w:pPr>
+      <w:r>
+        <w:t xml:space="preserve">Required environment variables in Railway dashboard: ANTHROPIC_API_KEY, SECRET_KEY. DATABASE_URL is provisioned automatically by Railway.</w:t>
+      </w:r>
+    </w:p>
+    <w:p>
+      <w:pPr>
+        <w:spacing w:after="120"/>
+      </w:pPr>
+      <w:r>
+        <w:t xml:space="preserve"/>
+      </w:r>
+    </w:p>
+    <w:p>
+      <w:pPr>
+        <w:pStyle w:val="Heading1"/>
+      </w:pPr>
+      <w:r>
         <w:t xml:space="preserve">Next Steps Before Launch</w:t>
       </w:r>
     </w:p>
@@ -1373,24 +1510,24 @@
           <w:b w:val="false"/>
           <w:bCs w:val="false"/>
         </w:rPr>
-        <w:t xml:space="preserve">Set up hosting (Railway or Render recommended)</w:t>
-      </w:r>
-    </w:p>
-    <w:p>
-      <w:pPr>
-        <w:pStyle w:val="ListParagraph"/>
-        <w:numPr>
-          <w:ilvl w:val="0"/>
-          <w:numId w:val="2"/>
-        </w:numPr>
-        <w:spacing w:after="100"/>
-      </w:pPr>
-      <w:r>
-        <w:rPr>
-          <w:b w:val="false"/>
-          <w:bCs w:val="false"/>
-        </w:rPr>
-        <w:t xml:space="preserve">Migrate database from SQLite to PostgreSQL for multi-user support</w:t>
+        <w:t xml:space="preserve">Set up hosting on Railway — shipped. See Deployment section.</w:t>
+      </w:r>
+    </w:p>
+    <w:p>
+      <w:pPr>
+        <w:pStyle w:val="ListParagraph"/>
+        <w:numPr>
+          <w:ilvl w:val="0"/>
+          <w:numId w:val="2"/>
+        </w:numPr>
+        <w:spacing w:after="100"/>
+      </w:pPr>
+      <w:r>
+        <w:rPr>
+          <w:b w:val="false"/>
+          <w:bCs w:val="false"/>
+        </w:rPr>
+        <w:t xml:space="preserve">Migrate database from SQLite to PostgreSQL for multi-user support — shipped. db.create_all() and run_migrations() are now called at import time (not just inside __main__) so tables and schema migrations run automatically on Railway/gunicorn startup.</w:t>
       </w:r>
     </w:p>
     <w:p>

</xml_diff>